<commit_message>
Finalize the RAGTune arXiv manuscript sources
</commit_message>
<xml_diff>
--- a/paper/preprints/RAGTune_ArXiv_Preprint_v0.1.1-rc1.docx
+++ b/paper/preprints/RAGTune_ArXiv_Preprint_v0.1.1-rc1.docx
@@ -208,23 +208,8 @@
         </w:rPr>
       </w:pPr>
       <w:r>
-        <w:rPr>
-          <w:rFonts w:asciiTheme="majorHAnsi" w:hAnsiTheme="majorHAnsi"/>
-          <w:color w:val="000000" w:themeColor="text1"/>
-          <w:sz w:val="17"/>
-        </w:rPr>
-        <w:t xml:space="preserve">Code and artifacts: </w:t>
+        <w:t>Code and artifacts: github.com/AIM-RAGTune/rag-tuning-governance (legacy /rag-tuning-governance-public URL redirects)</w:t>
       </w:r>
-      <w:hyperlink r:id="rId8">
-        <w:r>
-          <w:rPr>
-            <w:rFonts w:asciiTheme="majorHAnsi" w:hAnsiTheme="majorHAnsi"/>
-            <w:color w:val="000000" w:themeColor="text1"/>
-            <w:u w:val="single"/>
-          </w:rPr>
-          <w:t>github.com/AIM-RAGTune/rag-tuning-governance-public</w:t>
-        </w:r>
-      </w:hyperlink>
     </w:p>
     <w:p>
       <w:pPr>
@@ -6107,6 +6092,17 @@
         <w:spacing w:after="84" w:line="254" w:lineRule="auto"/>
         <w:ind w:firstLine="317"/>
         <w:jc w:val="both"/>
+      </w:pPr>
+      <w:r>
+        <w:t>The governance controller treats quality signals as inputs and inherits their variance; deterministic proxy composites were chosen for the public program precisely to avoid judge-model variance, and governed use of LLM-as-judge signals would require variance characterization first.</w:t>
+      </w:r>
+    </w:p>
+    <w:p>
+      <w:pPr>
+        <w:pStyle w:val="BodyText"/>
+        <w:spacing w:after="84" w:line="254" w:lineRule="auto"/>
+        <w:ind w:firstLine="317"/>
+        <w:jc w:val="both"/>
         <w:rPr>
           <w:rFonts w:asciiTheme="majorHAnsi" w:hAnsiTheme="majorHAnsi"/>
           <w:color w:val="000000" w:themeColor="text1"/>
@@ -6137,6 +6133,17 @@
           <w:color w:val="000000" w:themeColor="text1"/>
         </w:rPr>
         <w:t>The program is longitudinal and adaptive rather than a single preregistered experiment. Repeated design changes create multiplicity and researcher degrees of freedom; some observations are dependent, and early intervals were demonstrably low-information. The response is procedural rather than statistical sleight of hand: preserve chronology, distinguish development from confirmatory evidence, report grouped analyses only when implemented, and avoid a pooled significance claim.</w:t>
+      </w:r>
+    </w:p>
+    <w:p>
+      <w:pPr>
+        <w:pStyle w:val="BodyText"/>
+        <w:spacing w:after="84" w:line="254" w:lineRule="auto"/>
+        <w:ind w:firstLine="317"/>
+        <w:jc w:val="both"/>
+      </w:pPr>
+      <w:r>
+        <w:t>Fixed predeclared margins are a deliberate audit property, and extensions to group-sequential or adaptive designs with prespecified spending functions are compatible future work.</w:t>
       </w:r>
     </w:p>
     <w:p>
@@ -9498,28 +9505,7 @@
         </w:rPr>
       </w:pPr>
       <w:r>
-        <w:rPr>
-          <w:rFonts w:asciiTheme="majorHAnsi" w:hAnsiTheme="majorHAnsi"/>
-          <w:color w:val="000000" w:themeColor="text1"/>
-          <w:sz w:val="16"/>
-        </w:rPr>
-        <w:t>[7] X. Yang, K. Sun, H. Xin, et al., 'CRAG</w:t>
-      </w:r>
-      <w:r>
-        <w:rPr>
-          <w:rFonts w:asciiTheme="majorHAnsi" w:hAnsiTheme="majorHAnsi"/>
-          <w:color w:val="000000" w:themeColor="text1"/>
-          <w:sz w:val="16"/>
-        </w:rPr>
-        <w:t>:</w:t>
-      </w:r>
-      <w:r>
-        <w:rPr>
-          <w:rFonts w:asciiTheme="majorHAnsi" w:hAnsiTheme="majorHAnsi"/>
-          <w:color w:val="000000" w:themeColor="text1"/>
-          <w:sz w:val="16"/>
-        </w:rPr>
-        <w:t>Comprehensive RAG Benchmark,' arXiv:2406.04744, 2024.</w:t>
+        <w:t>[7] X. Yang, K. Sun, H. Xin, et al., 'CRAG: Comprehensive RAG Benchmark,' arXiv:2406.04744, 2024.</w:t>
       </w:r>
     </w:p>
     <w:p>
@@ -9753,7 +9739,7 @@
           <w:color w:val="000000" w:themeColor="text1"/>
           <w:sz w:val="16"/>
         </w:rPr>
-        <w:t>[20] AIM-RAGTune Contributors, RAGTune Governance, version 0.1.0-rc1, 2026. https://github.com/AIM-RAGTune/rag-tuning-governance-public.</w:t>
+        <w:t>[20] AIM-RAGTune Contributors, RAGTune Governance, version 0.1.0-rc1, 2026. https://github.com/AIM-RAGTune/rag-tuning-governance.</w:t>
       </w:r>
     </w:p>
     <w:p>

</xml_diff>